<commit_message>
Manual figures the 3.2 way (Dave 2026-10-19): each panel's label drawn into the image under its panel (regen_engine_figs.py SPEC labels, Liberation Sans; --assemble-only reuses the pages), the image and the FIGURE line centered in every render (tools/figure_captions.lua -> Figure / FigureCaption paragraph styles in reference.docx, .Figure/.FigureCaption in manual.css); the loose label lines under figures 3, 4, 6, 10, 37, 60, 61 removed from the text; PDFs and the edit copies refreshed
Co-Authored-By: Claude Fable 5.1 <noreply@anthropic.com>
</commit_message>
<xml_diff>
--- a/docs/macos-manual/edits/macosCmdRef_baseline.docx
+++ b/docs/macos-manual/edits/macosCmdRef_baseline.docx
@@ -76760,6 +76760,28 @@
       <w:szCs w:val="15"/>
     </w:rPr>
   </w:style>
+  <w:style w:styleId="Figure" w:type="paragraph">
+    <w:name w:val="Figure"/>
+    <w:basedOn w:val="Normal"/>
+    <w:pPr>
+      <w:keepNext/>
+      <w:spacing w:after="60" w:before="120"/>
+      <w:jc w:val="center"/>
+    </w:pPr>
+  </w:style>
+  <w:style w:styleId="FigureCaption" w:type="paragraph">
+    <w:name w:val="FigureCaption"/>
+    <w:basedOn w:val="Normal"/>
+    <w:pPr>
+      <w:spacing w:after="240" w:before="60"/>
+      <w:jc w:val="center"/>
+    </w:pPr>
+    <w:rPr>
+      <w:rFonts w:ascii="Times New Roman" w:cs="Times New Roman" w:hAnsi="Times New Roman"/>
+      <w:sz w:val="20"/>
+      <w:szCs w:val="20"/>
+    </w:rPr>
+  </w:style>
   <w:style w:type="character" w:customStyle="1" w:styleId="KeywordTok">
     <w:name w:val="KeywordTok"/>
     <w:basedOn w:val="VerbatimChar"/>

</xml_diff>

<commit_message>
Manual: the startup model-size prompt (PLAN_CONSOLIDATION 1.2 (yy), macos 49c87e13) -- Section 3.3 lists all seven sizes (128 ... 8192; it said 128-2048) and says Return takes the default 256, an answer that is not one of the sizes is refused naming it and asked again, and five refusals or end of input stop MACOS with exit status 1; Appendix D's agent note the same; cmdref 01_cli_syntax.md (the prompt reads 'MACOS model size:', not 'Enter model size:', and the refusal); cmdref regenerated (the CLI-suite lines gain STARTUP_size and the peer's ZERN_mode_count / ZERN_refused).  make all pdf + cmdref-pdf: 244 / 118 pages; the edit copies (both equal to their baselines before the refresh) and docs/macosMan.pdf / macosCmdRef.pdf refreshed.
Co-Authored-By: Claude Opus 5.5 <noreply@anthropic.com>
</commit_message>
<xml_diff>
--- a/docs/macos-manual/edits/macosCmdRef_baseline.docx
+++ b/docs/macos-manual/edits/macosCmdRef_baseline.docx
@@ -2261,7 +2261,7 @@
         <w:rPr>
           <w:rStyle w:val="VerbatimChar"/>
         </w:rPr>
-        <w:t xml:space="preserve">Enter model size: 256</w:t>
+        <w:t xml:space="preserve">MACOS model size: 256</w:t>
       </w:r>
       <w:r>
         <w:br/>
@@ -2361,7 +2361,25 @@
         <w:t xml:space="preserve"> </w:t>
       </w:r>
       <w:r>
-        <w:t xml:space="preserve">runtime arrays; 256 is a good default for the bundled examples.</w:t>
+        <w:t xml:space="preserve">runtime arrays; 256 is a good default for the bundled examples, and</w:t>
+      </w:r>
+      <w:r>
+        <w:t xml:space="preserve"> </w:t>
+      </w:r>
+      <w:r>
+        <w:t xml:space="preserve">Return takes it. The answer must be one of 128, 256, 512, 1024,</w:t>
+      </w:r>
+      <w:r>
+        <w:t xml:space="preserve"> </w:t>
+      </w:r>
+      <w:r>
+        <w:t xml:space="preserve">2048, 4096, 8192: anything else is refused, naming it, and asked</w:t>
+      </w:r>
+      <w:r>
+        <w:t xml:space="preserve"> </w:t>
+      </w:r>
+      <w:r>
+        <w:t xml:space="preserve">again; five refusals, or end of input, stop MACOS with exit status 1.</w:t>
       </w:r>
     </w:p>
     <w:p>
@@ -5052,6 +5070,18 @@
         <w:t xml:space="preserve">PARTIALS_inputray.jou</w:t>
       </w:r>
       <w:r>
+        <w:t xml:space="preserve">,</w:t>
+      </w:r>
+      <w:r>
+        <w:t xml:space="preserve"> </w:t>
+      </w:r>
+      <w:r>
+        <w:rPr>
+          <w:rStyle w:val="VerbatimChar"/>
+        </w:rPr>
+        <w:t xml:space="preserve">ZERN_mode_count.jou</w:t>
+      </w:r>
+      <w:r>
         <w:t xml:space="preserve"> </w:t>
       </w:r>
       <w:r>
@@ -7980,6 +8010,18 @@
         <w:rPr>
           <w:rStyle w:val="VerbatimChar"/>
         </w:rPr>
+        <w:t xml:space="preserve">STARTUP_size.jou</w:t>
+      </w:r>
+      <w:r>
+        <w:t xml:space="preserve">,</w:t>
+      </w:r>
+      <w:r>
+        <w:t xml:space="preserve"> </w:t>
+      </w:r>
+      <w:r>
+        <w:rPr>
+          <w:rStyle w:val="VerbatimChar"/>
+        </w:rPr>
         <w:t xml:space="preserve">WINDOW_GBS.jou</w:t>
       </w:r>
       <w:r>
@@ -7993,6 +8035,18 @@
           <w:rStyle w:val="VerbatimChar"/>
         </w:rPr>
         <w:t xml:space="preserve">WLENS_SWL.jou</w:t>
+      </w:r>
+      <w:r>
+        <w:t xml:space="preserve">,</w:t>
+      </w:r>
+      <w:r>
+        <w:t xml:space="preserve"> </w:t>
+      </w:r>
+      <w:r>
+        <w:rPr>
+          <w:rStyle w:val="VerbatimChar"/>
+        </w:rPr>
+        <w:t xml:space="preserve">ZERN_mode_count.jou</w:t>
       </w:r>
       <w:r>
         <w:t xml:space="preserve">,</w:t>
@@ -8467,6 +8521,18 @@
           <w:rStyle w:val="VerbatimChar"/>
         </w:rPr>
         <w:t xml:space="preserve">ZCOEF_zero_rays.jou</w:t>
+      </w:r>
+      <w:r>
+        <w:t xml:space="preserve">,</w:t>
+      </w:r>
+      <w:r>
+        <w:t xml:space="preserve"> </w:t>
+      </w:r>
+      <w:r>
+        <w:rPr>
+          <w:rStyle w:val="VerbatimChar"/>
+        </w:rPr>
+        <w:t xml:space="preserve">ZERN_mode_count.jou</w:t>
       </w:r>
       <w:r>
         <w:t xml:space="preserve">,</w:t>
@@ -10991,6 +11057,18 @@
           <w:rStyle w:val="VerbatimChar"/>
         </w:rPr>
         <w:t xml:space="preserve">ZCOEF_zero_rays.jou</w:t>
+      </w:r>
+      <w:r>
+        <w:t xml:space="preserve">,</w:t>
+      </w:r>
+      <w:r>
+        <w:t xml:space="preserve"> </w:t>
+      </w:r>
+      <w:r>
+        <w:rPr>
+          <w:rStyle w:val="VerbatimChar"/>
+        </w:rPr>
+        <w:t xml:space="preserve">ZERN_mode_count.jou</w:t>
       </w:r>
       <w:r>
         <w:t xml:space="preserve">,</w:t>
@@ -44771,6 +44849,18 @@
           <w:rStyle w:val="VerbatimChar"/>
         </w:rPr>
         <w:t xml:space="preserve">ZABERR_ZRM_DOPD.jou</w:t>
+      </w:r>
+      <w:r>
+        <w:t xml:space="preserve">,</w:t>
+      </w:r>
+      <w:r>
+        <w:t xml:space="preserve"> </w:t>
+      </w:r>
+      <w:r>
+        <w:rPr>
+          <w:rStyle w:val="VerbatimChar"/>
+        </w:rPr>
+        <w:t xml:space="preserve">ZERN_refused.jou</w:t>
       </w:r>
       <w:r>
         <w:t xml:space="preserve"> </w:t>

</xml_diff>

<commit_message>
Manual: cleanup round 1 (BRIEF_to_cleanup_round1; macos f743b307..eff48867) -- make transcripts on the fixed engine: Appendix A's ImageDemo listing reads PropType= Geometric ((dd)), Section 4's RESET / STATUS transcript reads 'Current WF plot type=GRAY' after RESET ((i)), and s05_coord picks up the (ff) LocalCoord fix (0efc2dec; the transcript predated it: yLocal / zLocal round-off); cmdref regenerated (the CLI-suite lines gain DOPD_identical / IMAGEDEMO_proptype).  make all pdf + cmdref-pdf: 244 / 118 pages; the edit copies (both equal to their baselines before the refresh) and docs/macosMan.pdf / macosCmdRef.pdf refreshed
Co-Authored-By: Claude Opus 5.5 <noreply@anthropic.com>
</commit_message>
<xml_diff>
--- a/docs/macos-manual/edits/macosCmdRef_baseline.docx
+++ b/docs/macos-manual/edits/macosCmdRef_baseline.docx
@@ -5711,7 +5711,7 @@
         <w:t xml:space="preserve"> </w:t>
       </w:r>
       <w:r>
-        <w:t xml:space="preserve">none. Resets the trace state and the obscuration option to 1; the plot type is NOT reset (1.2 (i)).</w:t>
+        <w:t xml:space="preserve">none. Resets the trace state, the obscuration option to 1 and the plot type to GRAY (its start-up value; 1.2 (i), 2026-10-22).</w:t>
       </w:r>
     </w:p>
     <w:p>
@@ -5731,19 +5731,19 @@
         <w:t xml:space="preserve"> </w:t>
       </w:r>
       <w:r>
-        <w:t xml:space="preserve">obscuration option, the stretch type, beam type, and pixel</w:t>
-      </w:r>
-      <w:r>
-        <w:t xml:space="preserve"> </w:t>
-      </w:r>
-      <w:r>
-        <w:t xml:space="preserve">settings. Measured 2026-10-16: the surface-plot type set by</w:t>
-      </w:r>
-      <w:r>
-        <w:t xml:space="preserve"> </w:t>
-      </w:r>
-      <w:r>
-        <w:t xml:space="preserve">NONE/GRAY/… is NOT reset (STATUS keeps showing it). The</w:t>
+        <w:t xml:space="preserve">obscuration option, the stretch type, the surface-plot type</w:t>
+      </w:r>
+      <w:r>
+        <w:t xml:space="preserve"> </w:t>
+      </w:r>
+      <w:r>
+        <w:t xml:space="preserve">(back to GRAY, whatever NONE/SLICE/… set), beam type, and pixel</w:t>
+      </w:r>
+      <w:r>
+        <w:t xml:space="preserve"> </w:t>
+      </w:r>
+      <w:r>
+        <w:t xml:space="preserve">settings. The</w:t>
       </w:r>
       <w:r>
         <w:t xml:space="preserve"> </w:t>
@@ -10312,6 +10312,30 @@
         <w:rPr>
           <w:rStyle w:val="VerbatimChar"/>
         </w:rPr>
+        <w:t xml:space="preserve">COORD_offaxis_frame.jou</w:t>
+      </w:r>
+      <w:r>
+        <w:t xml:space="preserve">,</w:t>
+      </w:r>
+      <w:r>
+        <w:t xml:space="preserve"> </w:t>
+      </w:r>
+      <w:r>
+        <w:rPr>
+          <w:rStyle w:val="VerbatimChar"/>
+        </w:rPr>
+        <w:t xml:space="preserve">DOPD_identical.jou</w:t>
+      </w:r>
+      <w:r>
+        <w:t xml:space="preserve">,</w:t>
+      </w:r>
+      <w:r>
+        <w:t xml:space="preserve"> </w:t>
+      </w:r>
+      <w:r>
+        <w:rPr>
+          <w:rStyle w:val="VerbatimChar"/>
+        </w:rPr>
         <w:t xml:space="preserve">EFL_SYSPROP.jou</w:t>
       </w:r>
       <w:r>
@@ -10397,6 +10421,18 @@
           <w:rStyle w:val="VerbatimChar"/>
         </w:rPr>
         <w:t xml:space="preserve">HELP_POL.jou</w:t>
+      </w:r>
+      <w:r>
+        <w:t xml:space="preserve">,</w:t>
+      </w:r>
+      <w:r>
+        <w:t xml:space="preserve"> </w:t>
+      </w:r>
+      <w:r>
+        <w:rPr>
+          <w:rStyle w:val="VerbatimChar"/>
+        </w:rPr>
+        <w:t xml:space="preserve">IMAGEDEMO_proptype.jou</w:t>
       </w:r>
       <w:r>
         <w:t xml:space="preserve">,</w:t>
@@ -13153,6 +13189,18 @@
         <w:rPr>
           <w:rStyle w:val="VerbatimChar"/>
         </w:rPr>
+        <w:t xml:space="preserve">IMAGEDEMO_proptype.jou</w:t>
+      </w:r>
+      <w:r>
+        <w:t xml:space="preserve">,</w:t>
+      </w:r>
+      <w:r>
+        <w:t xml:space="preserve"> </w:t>
+      </w:r>
+      <w:r>
+        <w:rPr>
+          <w:rStyle w:val="VerbatimChar"/>
+        </w:rPr>
         <w:t xml:space="preserve">IndRef_stamp.jou</w:t>
       </w:r>
       <w:r>
@@ -17966,6 +18014,18 @@
         <w:t xml:space="preserve">COORD_ACOOR.jou</w:t>
       </w:r>
       <w:r>
+        <w:t xml:space="preserve">,</w:t>
+      </w:r>
+      <w:r>
+        <w:t xml:space="preserve"> </w:t>
+      </w:r>
+      <w:r>
+        <w:rPr>
+          <w:rStyle w:val="VerbatimChar"/>
+        </w:rPr>
+        <w:t xml:space="preserve">COORD_offaxis_frame.jou</w:t>
+      </w:r>
+      <w:r>
         <w:t xml:space="preserve"> </w:t>
       </w:r>
       <w:r>
@@ -25725,6 +25785,18 @@
           <w:rStyle w:val="VerbatimChar"/>
         </w:rPr>
         <w:t xml:space="preserve">COMPOSE_ADD_NOISE.jou</w:t>
+      </w:r>
+      <w:r>
+        <w:t xml:space="preserve">,</w:t>
+      </w:r>
+      <w:r>
+        <w:t xml:space="preserve"> </w:t>
+      </w:r>
+      <w:r>
+        <w:rPr>
+          <w:rStyle w:val="VerbatimChar"/>
+        </w:rPr>
+        <w:t xml:space="preserve">DOPD_identical.jou</w:t>
       </w:r>
       <w:r>
         <w:t xml:space="preserve">,</w:t>
@@ -26872,6 +26944,18 @@
         <w:rPr>
           <w:rStyle w:val="VerbatimChar"/>
         </w:rPr>
+        <w:t xml:space="preserve">DOPD_identical.jou</w:t>
+      </w:r>
+      <w:r>
+        <w:t xml:space="preserve">,</w:t>
+      </w:r>
+      <w:r>
+        <w:t xml:space="preserve"> </w:t>
+      </w:r>
+      <w:r>
+        <w:rPr>
+          <w:rStyle w:val="VerbatimChar"/>
+        </w:rPr>
         <w:t xml:space="preserve">METCALC.jou</w:t>
       </w:r>
       <w:r>
@@ -33795,6 +33879,18 @@
           <w:rStyle w:val="VerbatimChar"/>
         </w:rPr>
         <w:t xml:space="preserve">BINARY_CENTER.jou</w:t>
+      </w:r>
+      <w:r>
+        <w:t xml:space="preserve">,</w:t>
+      </w:r>
+      <w:r>
+        <w:t xml:space="preserve"> </w:t>
+      </w:r>
+      <w:r>
+        <w:rPr>
+          <w:rStyle w:val="VerbatimChar"/>
+        </w:rPr>
+        <w:t xml:space="preserve">DOPD_identical.jou</w:t>
       </w:r>
       <w:r>
         <w:t xml:space="preserve">,</w:t>
@@ -35841,6 +35937,18 @@
         <w:rPr>
           <w:rStyle w:val="VerbatimChar"/>
         </w:rPr>
+        <w:t xml:space="preserve">DOPD_identical.jou</w:t>
+      </w:r>
+      <w:r>
+        <w:t xml:space="preserve">,</w:t>
+      </w:r>
+      <w:r>
+        <w:t xml:space="preserve"> </w:t>
+      </w:r>
+      <w:r>
+        <w:rPr>
+          <w:rStyle w:val="VerbatimChar"/>
+        </w:rPr>
         <w:t xml:space="preserve">ZABERR_ZRM_DOPD.jou</w:t>
       </w:r>
       <w:r>
@@ -49929,6 +50037,18 @@
           <w:i/>
         </w:rPr>
         <w:t xml:space="preserve">CLI suite:</w:t>
+      </w:r>
+      <w:r>
+        <w:t xml:space="preserve"> </w:t>
+      </w:r>
+      <w:r>
+        <w:rPr>
+          <w:rStyle w:val="VerbatimChar"/>
+        </w:rPr>
+        <w:t xml:space="preserve">DOPD_identical.jou</w:t>
+      </w:r>
+      <w:r>
+        <w:t xml:space="preserve">,</w:t>
       </w:r>
       <w:r>
         <w:t xml:space="preserve"> </w:t>

</xml_diff>

<commit_message>
Manual + cmdref rebuilt for Dave's rulings of 2026-10-22 (a239d5e6 / b9cdb843 / 0f9983eb) -- Section 4's PropType, nCoat and GridFile lines and the cmdref OLD entry, and the cmdref CLI-suite lists now name COAT_legacy.jou and GRIDFILE_beside.jou.  make transcripts at 0f9983eb: no transcript changed.  Edit copies were equal to their baselines before the refresh; PDFs 244 / 118 pages
Co-Authored-By: Claude Opus 5.5 <noreply@anthropic.com>
</commit_message>
<xml_diff>
--- a/docs/macos-manual/edits/macosCmdRef_baseline.docx
+++ b/docs/macos-manual/edits/macosCmdRef_baseline.docx
@@ -7734,6 +7734,18 @@
         <w:rPr>
           <w:rStyle w:val="VerbatimChar"/>
         </w:rPr>
+        <w:t xml:space="preserve">COAT_legacy.jou</w:t>
+      </w:r>
+      <w:r>
+        <w:t xml:space="preserve">,</w:t>
+      </w:r>
+      <w:r>
+        <w:t xml:space="preserve"> </w:t>
+      </w:r>
+      <w:r>
+        <w:rPr>
+          <w:rStyle w:val="VerbatimChar"/>
+        </w:rPr>
         <w:t xml:space="preserve">COORD_ACOOR.jou</w:t>
       </w:r>
       <w:r>
@@ -7795,6 +7807,18 @@
           <w:rStyle w:val="VerbatimChar"/>
         </w:rPr>
         <w:t xml:space="preserve">GLASS_mod_save.jou</w:t>
+      </w:r>
+      <w:r>
+        <w:t xml:space="preserve">,</w:t>
+      </w:r>
+      <w:r>
+        <w:t xml:space="preserve"> </w:t>
+      </w:r>
+      <w:r>
+        <w:rPr>
+          <w:rStyle w:val="VerbatimChar"/>
+        </w:rPr>
+        <w:t xml:space="preserve">GRIDFILE_beside.jou</w:t>
       </w:r>
       <w:r>
         <w:t xml:space="preserve">,</w:t>
@@ -8292,6 +8316,18 @@
         <w:rPr>
           <w:rStyle w:val="VerbatimChar"/>
         </w:rPr>
+        <w:t xml:space="preserve">COAT_legacy.jou</w:t>
+      </w:r>
+      <w:r>
+        <w:t xml:space="preserve">,</w:t>
+      </w:r>
+      <w:r>
+        <w:t xml:space="preserve"> </w:t>
+      </w:r>
+      <w:r>
+        <w:rPr>
+          <w:rStyle w:val="VerbatimChar"/>
+        </w:rPr>
         <w:t xml:space="preserve">COORD_ACOOR.jou</w:t>
       </w:r>
       <w:r>
@@ -8341,6 +8377,18 @@
           <w:rStyle w:val="VerbatimChar"/>
         </w:rPr>
         <w:t xml:space="preserve">GPERTURB.jou</w:t>
+      </w:r>
+      <w:r>
+        <w:t xml:space="preserve">,</w:t>
+      </w:r>
+      <w:r>
+        <w:t xml:space="preserve"> </w:t>
+      </w:r>
+      <w:r>
+        <w:rPr>
+          <w:rStyle w:val="VerbatimChar"/>
+        </w:rPr>
+        <w:t xml:space="preserve">GRIDFILE_beside.jou</w:t>
       </w:r>
       <w:r>
         <w:t xml:space="preserve">,</w:t>
@@ -10288,6 +10336,18 @@
         <w:rPr>
           <w:rStyle w:val="VerbatimChar"/>
         </w:rPr>
+        <w:t xml:space="preserve">COAT_legacy.jou</w:t>
+      </w:r>
+      <w:r>
+        <w:t xml:space="preserve">,</w:t>
+      </w:r>
+      <w:r>
+        <w:t xml:space="preserve"> </w:t>
+      </w:r>
+      <w:r>
+        <w:rPr>
+          <w:rStyle w:val="VerbatimChar"/>
+        </w:rPr>
         <w:t xml:space="preserve">COMPOSE_ADD_NOISE.jou</w:t>
       </w:r>
       <w:r>
@@ -10397,6 +10457,18 @@
           <w:rStyle w:val="VerbatimChar"/>
         </w:rPr>
         <w:t xml:space="preserve">GPERTURB.jou</w:t>
+      </w:r>
+      <w:r>
+        <w:t xml:space="preserve">,</w:t>
+      </w:r>
+      <w:r>
+        <w:t xml:space="preserve"> </w:t>
+      </w:r>
+      <w:r>
+        <w:rPr>
+          <w:rStyle w:val="VerbatimChar"/>
+        </w:rPr>
+        <w:t xml:space="preserve">GRIDFILE_beside.jou</w:t>
       </w:r>
       <w:r>
         <w:t xml:space="preserve">,</w:t>
@@ -11408,7 +11480,7 @@
         <w:t xml:space="preserve"> </w:t>
       </w:r>
       <w:r>
-        <w:t xml:space="preserve">(0..15) resolves to its name, 0 = Geometric; an unrecognized value is reported and defaulted. Gates:</w:t>
+        <w:t xml:space="preserve">(0..15) resolves to its name, 0 = Geometric; an unrecognized value is refused at load, by name (1.2 (dd)). Gates:</w:t>
       </w:r>
       <w:r>
         <w:t xml:space="preserve"> </w:t>
@@ -12146,6 +12218,18 @@
           <w:rStyle w:val="VerbatimChar"/>
         </w:rPr>
         <w:t xml:space="preserve">GLASS_mod_save.jou</w:t>
+      </w:r>
+      <w:r>
+        <w:t xml:space="preserve">,</w:t>
+      </w:r>
+      <w:r>
+        <w:t xml:space="preserve"> </w:t>
+      </w:r>
+      <w:r>
+        <w:rPr>
+          <w:rStyle w:val="VerbatimChar"/>
+        </w:rPr>
+        <w:t xml:space="preserve">GRIDFILE_beside.jou</w:t>
       </w:r>
       <w:r>
         <w:t xml:space="preserve">,</w:t>
@@ -13189,6 +13273,18 @@
         <w:rPr>
           <w:rStyle w:val="VerbatimChar"/>
         </w:rPr>
+        <w:t xml:space="preserve">COAT_legacy.jou</w:t>
+      </w:r>
+      <w:r>
+        <w:t xml:space="preserve">,</w:t>
+      </w:r>
+      <w:r>
+        <w:t xml:space="preserve"> </w:t>
+      </w:r>
+      <w:r>
+        <w:rPr>
+          <w:rStyle w:val="VerbatimChar"/>
+        </w:rPr>
         <w:t xml:space="preserve">IMAGEDEMO_proptype.jou</w:t>
       </w:r>
       <w:r>
@@ -25784,6 +25880,18 @@
         <w:rPr>
           <w:rStyle w:val="VerbatimChar"/>
         </w:rPr>
+        <w:t xml:space="preserve">COAT_legacy.jou</w:t>
+      </w:r>
+      <w:r>
+        <w:t xml:space="preserve">,</w:t>
+      </w:r>
+      <w:r>
+        <w:t xml:space="preserve"> </w:t>
+      </w:r>
+      <w:r>
+        <w:rPr>
+          <w:rStyle w:val="VerbatimChar"/>
+        </w:rPr>
         <w:t xml:space="preserve">COMPOSE_ADD_NOISE.jou</w:t>
       </w:r>
       <w:r>
@@ -25809,6 +25917,18 @@
           <w:rStyle w:val="VerbatimChar"/>
         </w:rPr>
         <w:t xml:space="preserve">FILTERS_MULTISPEC.jou</w:t>
+      </w:r>
+      <w:r>
+        <w:t xml:space="preserve">,</w:t>
+      </w:r>
+      <w:r>
+        <w:t xml:space="preserve"> </w:t>
+      </w:r>
+      <w:r>
+        <w:rPr>
+          <w:rStyle w:val="VerbatimChar"/>
+        </w:rPr>
+        <w:t xml:space="preserve">GRIDFILE_beside.jou</w:t>
       </w:r>
       <w:r>
         <w:t xml:space="preserve">,</w:t>
@@ -33879,6 +33999,18 @@
           <w:rStyle w:val="VerbatimChar"/>
         </w:rPr>
         <w:t xml:space="preserve">BINARY_CENTER.jou</w:t>
+      </w:r>
+      <w:r>
+        <w:t xml:space="preserve">,</w:t>
+      </w:r>
+      <w:r>
+        <w:t xml:space="preserve"> </w:t>
+      </w:r>
+      <w:r>
+        <w:rPr>
+          <w:rStyle w:val="VerbatimChar"/>
+        </w:rPr>
+        <w:t xml:space="preserve">COAT_legacy.jou</w:t>
       </w:r>
       <w:r>
         <w:t xml:space="preserve">,</w:t>

</xml_diff>